<commit_message>
fix: make the cover date and engineer name editable
The Başhan logo stays as the original image. The cover lines, including the date and the environmental engineer's name, are black text that can be changed in Word.

Co-authored-by: iremalisan <iremalisan@users.noreply.github.com>
</commit_message>
<xml_diff>
--- a/public/belgeler/2025-is-akim-semasi-ve-proses-ozeti-vaziyet-planlari.docx
+++ b/public/belgeler/2025-is-akim-semasi-ve-proses-ozeti-vaziyet-planlari.docx
@@ -4,13 +4,13 @@
   <w:body>
     <w:p>
       <w:pPr>
-        <w:spacing w:before="0" w:after="0"/>
+        <w:spacing w:before="240" w:after="360"/>
         <w:jc w:val="center"/>
       </w:pPr>
       <w:r>
         <w:drawing>
           <wp:inline xmlns:a="http://schemas.openxmlformats.org/drawingml/2006/main" xmlns:pic="http://schemas.openxmlformats.org/drawingml/2006/picture">
-            <wp:extent cx="7056000" cy="10102034"/>
+            <wp:extent cx="2592000" cy="645705"/>
             <wp:docPr id="1" name="Picture 1"/>
             <wp:cNvGraphicFramePr>
               <a:graphicFrameLocks noChangeAspect="1"/>
@@ -19,7 +19,7 @@
               <a:graphicData uri="http://schemas.openxmlformats.org/drawingml/2006/picture">
                 <pic:pic>
                   <pic:nvPicPr>
-                    <pic:cNvPr id="0" name="image.jpg"/>
+                    <pic:cNvPr id="0" name="bashan-logo.png"/>
                     <pic:cNvPicPr/>
                   </pic:nvPicPr>
                   <pic:blipFill>
@@ -31,7 +31,7 @@
                   <pic:spPr>
                     <a:xfrm>
                       <a:off x="0" y="0"/>
-                      <a:ext cx="7056000" cy="10102034"/>
+                      <a:ext cx="2592000" cy="645705"/>
                     </a:xfrm>
                     <a:prstGeom prst="rect"/>
                   </pic:spPr>
@@ -43,9 +43,218 @@
       </w:r>
     </w:p>
     <w:p>
+      <w:pPr>
+        <w:spacing w:before="0" w:after="0" w:line="240" w:lineRule="auto"/>
+        <w:jc w:val="center"/>
+      </w:pPr>
       <w:r>
-        <w:br w:type="page"/>
+        <w:rPr>
+          <w:rFonts w:ascii="Times New Roman" w:hAnsi="Times New Roman" w:eastAsia="Times New Roman" w:cs="Times New Roman"/>
+          <w:b/>
+          <w:i w:val="0"/>
+          <w:color w:val="000000"/>
+          <w:sz w:val="32"/>
+          <w:lang w:val="tr-TR"/>
+        </w:rPr>
+        <w:t>BAŞHAN AGRO GIDA SANAYİ VE</w:t>
       </w:r>
+    </w:p>
+    <w:p>
+      <w:pPr>
+        <w:spacing w:before="0" w:after="0" w:line="240" w:lineRule="auto"/>
+        <w:jc w:val="center"/>
+      </w:pPr>
+      <w:r>
+        <w:rPr>
+          <w:rFonts w:ascii="Times New Roman" w:hAnsi="Times New Roman" w:eastAsia="Times New Roman" w:cs="Times New Roman"/>
+          <w:b/>
+          <w:i w:val="0"/>
+          <w:color w:val="000000"/>
+          <w:sz w:val="32"/>
+          <w:lang w:val="tr-TR"/>
+        </w:rPr>
+        <w:t>TİCARET ANONİM ŞİRKETİ ENTEGRE</w:t>
+      </w:r>
+    </w:p>
+    <w:p>
+      <w:pPr>
+        <w:spacing w:before="0" w:after="280" w:line="240" w:lineRule="auto"/>
+        <w:jc w:val="center"/>
+      </w:pPr>
+      <w:r>
+        <w:rPr>
+          <w:rFonts w:ascii="Times New Roman" w:hAnsi="Times New Roman" w:eastAsia="Times New Roman" w:cs="Times New Roman"/>
+          <w:b/>
+          <w:i w:val="0"/>
+          <w:color w:val="000000"/>
+          <w:sz w:val="32"/>
+          <w:lang w:val="tr-TR"/>
+        </w:rPr>
+        <w:t>MERSİN ŞUBESİ</w:t>
+      </w:r>
+    </w:p>
+    <w:p>
+      <w:pPr>
+        <w:spacing w:before="160" w:after="320" w:line="240" w:lineRule="auto"/>
+        <w:jc w:val="center"/>
+      </w:pPr>
+      <w:r>
+        <w:rPr>
+          <w:rFonts w:ascii="Times New Roman" w:hAnsi="Times New Roman" w:eastAsia="Times New Roman" w:cs="Times New Roman"/>
+          <w:b w:val="0"/>
+          <w:i w:val="0"/>
+          <w:color w:val="000000"/>
+          <w:sz w:val="24"/>
+          <w:lang w:val="tr-TR"/>
+        </w:rPr>
+        <w:t>Karacailyas Evren Mahallesi, Menekşe 1 Sokak No: 5/10</w:t>
+      </w:r>
+    </w:p>
+    <w:p>
+      <w:pPr>
+        <w:spacing w:before="0" w:after="0" w:line="240" w:lineRule="auto"/>
+        <w:jc w:val="center"/>
+      </w:pPr>
+      <w:r>
+        <w:rPr>
+          <w:rFonts w:ascii="Times New Roman" w:hAnsi="Times New Roman" w:eastAsia="Times New Roman" w:cs="Times New Roman"/>
+          <w:b w:val="0"/>
+          <w:i w:val="0"/>
+          <w:color w:val="000000"/>
+          <w:sz w:val="22"/>
+          <w:lang w:val="tr-TR"/>
+        </w:rPr>
+        <w:t>Elenmiş Paketlenmiş Bakliyat Ve Hububat, İç Mercimek, İç</w:t>
+      </w:r>
+    </w:p>
+    <w:p>
+      <w:pPr>
+        <w:spacing w:before="0" w:after="0" w:line="240" w:lineRule="auto"/>
+        <w:jc w:val="center"/>
+      </w:pPr>
+      <w:r>
+        <w:rPr>
+          <w:rFonts w:ascii="Times New Roman" w:hAnsi="Times New Roman" w:eastAsia="Times New Roman" w:cs="Times New Roman"/>
+          <w:b w:val="0"/>
+          <w:i w:val="0"/>
+          <w:color w:val="000000"/>
+          <w:sz w:val="22"/>
+          <w:lang w:val="tr-TR"/>
+        </w:rPr>
+        <w:t>Bezelye, Bulgur, Aşurelik Buğday, İrmik, Pirinç, Karma</w:t>
+      </w:r>
+    </w:p>
+    <w:p>
+      <w:pPr>
+        <w:spacing w:before="0" w:after="0" w:line="240" w:lineRule="auto"/>
+        <w:jc w:val="center"/>
+      </w:pPr>
+      <w:r>
+        <w:rPr>
+          <w:rFonts w:ascii="Times New Roman" w:hAnsi="Times New Roman" w:eastAsia="Times New Roman" w:cs="Times New Roman"/>
+          <w:b w:val="0"/>
+          <w:i w:val="0"/>
+          <w:color w:val="000000"/>
+          <w:sz w:val="22"/>
+          <w:lang w:val="tr-TR"/>
+        </w:rPr>
+        <w:t>Ve Pellet Yem İmalatı, Ahşap Palet İmalatı, Elektrik Üretimi</w:t>
+      </w:r>
+    </w:p>
+    <w:p>
+      <w:pPr>
+        <w:spacing w:before="0" w:after="320" w:line="240" w:lineRule="auto"/>
+        <w:jc w:val="center"/>
+      </w:pPr>
+      <w:r>
+        <w:rPr>
+          <w:rFonts w:ascii="Times New Roman" w:hAnsi="Times New Roman" w:eastAsia="Times New Roman" w:cs="Times New Roman"/>
+          <w:b w:val="0"/>
+          <w:i w:val="0"/>
+          <w:color w:val="000000"/>
+          <w:sz w:val="22"/>
+          <w:lang w:val="tr-TR"/>
+        </w:rPr>
+        <w:t>(Biyogaz)</w:t>
+      </w:r>
+    </w:p>
+    <w:p>
+      <w:pPr>
+        <w:spacing w:before="160" w:after="440" w:line="240" w:lineRule="auto"/>
+        <w:jc w:val="center"/>
+      </w:pPr>
+      <w:r>
+        <w:rPr>
+          <w:rFonts w:ascii="Times New Roman" w:hAnsi="Times New Roman" w:eastAsia="Times New Roman" w:cs="Times New Roman"/>
+          <w:b/>
+          <w:i w:val="0"/>
+          <w:color w:val="000000"/>
+          <w:sz w:val="26"/>
+          <w:lang w:val="tr-TR"/>
+        </w:rPr>
+        <w:t>İŞ AKIM ŞEMASI VE PROSES ÖZETİ</w:t>
+      </w:r>
+    </w:p>
+    <w:p>
+      <w:pPr>
+        <w:spacing w:before="120" w:after="240" w:line="240" w:lineRule="auto"/>
+        <w:jc w:val="center"/>
+      </w:pPr>
+      <w:r>
+        <w:rPr>
+          <w:rFonts w:ascii="Times New Roman" w:hAnsi="Times New Roman" w:eastAsia="Times New Roman" w:cs="Times New Roman"/>
+          <w:b w:val="0"/>
+          <w:i w:val="0"/>
+          <w:color w:val="000000"/>
+          <w:sz w:val="24"/>
+          <w:lang w:val="tr-TR"/>
+        </w:rPr>
+        <w:t>Diğdem YAR GÖREN</w:t>
+      </w:r>
+    </w:p>
+    <w:p>
+      <w:pPr>
+        <w:spacing w:before="0" w:after="440" w:line="240" w:lineRule="auto"/>
+        <w:jc w:val="center"/>
+      </w:pPr>
+      <w:r>
+        <w:rPr>
+          <w:rFonts w:ascii="Times New Roman" w:hAnsi="Times New Roman" w:eastAsia="Times New Roman" w:cs="Times New Roman"/>
+          <w:b w:val="0"/>
+          <w:i w:val="0"/>
+          <w:color w:val="000000"/>
+          <w:sz w:val="24"/>
+          <w:lang w:val="tr-TR"/>
+        </w:rPr>
+        <w:t>Çevre Mühendisi</w:t>
+      </w:r>
+    </w:p>
+    <w:p>
+      <w:pPr>
+        <w:spacing w:before="160" w:after="0" w:line="240" w:lineRule="auto"/>
+        <w:jc w:val="center"/>
+      </w:pPr>
+      <w:r>
+        <w:rPr>
+          <w:rFonts w:ascii="Times New Roman" w:hAnsi="Times New Roman" w:eastAsia="Times New Roman" w:cs="Times New Roman"/>
+          <w:b/>
+          <w:i w:val="0"/>
+          <w:color w:val="000000"/>
+          <w:sz w:val="28"/>
+          <w:lang w:val="tr-TR"/>
+        </w:rPr>
+        <w:t>ŞUBAT 2025</w:t>
+      </w:r>
+    </w:p>
+    <w:p>
+      <w:pPr>
+        <w:sectPr>
+          <w:pgSz w:w="11906" w:h="16838"/>
+          <w:pgMar w:top="907" w:right="1134" w:bottom="907" w:left="1134" w:header="720" w:footer="720" w:gutter="0"/>
+          <w:cols w:space="720"/>
+          <w:docGrid w:linePitch="360"/>
+        </w:sectPr>
+      </w:pPr>
     </w:p>
     <w:p>
       <w:pPr>

</xml_diff>